<commit_message>
Hand-off: Play Store guide
Co-Authored-By: Claude Opus 5 <noreply@anthropic.com>
</commit_message>
<xml_diff>
--- a/handoff/README.docx
+++ b/handoff/README.docx
@@ -1992,6 +1992,56 @@
       </w:pPr>
       <w:r>
         <w:t xml:space="preserve">8. Build, test, deploy, release</w:t>
+      </w:r>
+    </w:p>
+    <w:p/>
+    <w:p>
+      <w:r>
+        <w:t xml:space="preserve">Play Store: signed AAB via </w:t>
+      </w:r>
+      <w:r>
+        <w:rPr>
+          <w:rFonts w:ascii="Consolas" w:cs="Consolas" w:eastAsia="Consolas" w:hAnsi="Consolas"/>
+          <w:sz w:val="18"/>
+          <w:szCs w:val="18"/>
+        </w:rPr>
+        <w:t xml:space="preserve">cd android &amp;&amp; gradlew bundleRelease</w:t>
+      </w:r>
+      <w:r>
+        <w:t xml:space="preserve"> (reads </w:t>
+      </w:r>
+      <w:r>
+        <w:rPr>
+          <w:rFonts w:ascii="Consolas" w:cs="Consolas" w:eastAsia="Consolas" w:hAnsi="Consolas"/>
+          <w:sz w:val="18"/>
+          <w:szCs w:val="18"/>
+        </w:rPr>
+        <w:t xml:space="preserve">release/keystore.properties</w:t>
+      </w:r>
+      <w:r>
+        <w:t xml:space="preserve">; keystore is git-ignored — see </w:t>
+      </w:r>
+      <w:r>
+        <w:rPr>
+          <w:rFonts w:ascii="Consolas" w:cs="Consolas" w:eastAsia="Consolas" w:hAnsi="Consolas"/>
+          <w:sz w:val="18"/>
+          <w:szCs w:val="18"/>
+        </w:rPr>
+        <w:t xml:space="preserve">PLAY-STORE-GUIDE.md</w:t>
+      </w:r>
+      <w:r>
+        <w:t xml:space="preserve"> and keep </w:t>
+      </w:r>
+      <w:r>
+        <w:rPr>
+          <w:rFonts w:ascii="Consolas" w:cs="Consolas" w:eastAsia="Consolas" w:hAnsi="Consolas"/>
+          <w:sz w:val="18"/>
+          <w:szCs w:val="18"/>
+        </w:rPr>
+        <w:t xml:space="preserve">release/caloriemate-upload.jks</w:t>
+      </w:r>
+      <w:r>
+        <w:t xml:space="preserve"> backed up).</w:t>
       </w:r>
     </w:p>
     <w:p/>

</xml_diff>